<commit_message>
saving before system wipe
</commit_message>
<xml_diff>
--- a/game_report.docx
+++ b/game_report.docx
@@ -247,7 +247,7 @@
           <w:sz w:val="28"/>
           <w:szCs w:val="28"/>
         </w:rPr>
-        <w:t>По дисциплине «Учебно-исследовательская работа»</w:t>
+        <w:t>По учебной практике</w:t>
       </w:r>
     </w:p>
     <w:p>
@@ -270,7 +270,7 @@
           <w:sz w:val="28"/>
           <w:szCs w:val="28"/>
         </w:rPr>
-        <w:t>На тему: «Разработка игры “FNAP”»</w:t>
+        <w:t>На тему: Разработка игры “FNAP”</w:t>
       </w:r>
     </w:p>
     <w:p>
@@ -372,6 +372,11 @@
     <w:p>
       <w:pPr>
         <w:pStyle w:val="Normal"/>
+        <w:widowControl/>
+        <w:suppressAutoHyphens w:val="true"/>
+        <w:bidi w:val="0"/>
+        <w:spacing w:lineRule="auto" w:line="278" w:before="0" w:after="160"/>
+        <w:ind w:hanging="0" w:left="0" w:right="540"/>
         <w:jc w:val="right"/>
         <w:rPr>
           <w:rFonts w:ascii="Times New Roman" w:hAnsi="Times New Roman" w:cs="Times New Roman"/>
@@ -399,17 +404,27 @@
         </w:rPr>
       </w:pPr>
       <w:r>
-        <w:rPr>
-          <w:rFonts w:cs="Times New Roman" w:ascii="Times New Roman" w:hAnsi="Times New Roman"/>
-          <w:sz w:val="28"/>
-          <w:szCs w:val="28"/>
-        </w:rPr>
+        <w:rPr/>
         <w:t>____________               А.А. Петренко</w:t>
       </w:r>
     </w:p>
     <w:p>
       <w:pPr>
         <w:pStyle w:val="Normal"/>
+        <w:jc w:val="right"/>
+        <w:rPr>
+          <w:rFonts w:ascii="Times New Roman" w:hAnsi="Times New Roman" w:cs="Times New Roman"/>
+          <w:sz w:val="28"/>
+          <w:szCs w:val="28"/>
+        </w:rPr>
+      </w:pPr>
+      <w:r>
+        <w:rPr/>
+      </w:r>
+    </w:p>
+    <w:p>
+      <w:pPr>
+        <w:pStyle w:val="Normal"/>
         <w:jc w:val="center"/>
         <w:rPr>
           <w:rFonts w:ascii="Times New Roman" w:hAnsi="Times New Roman" w:cs="Times New Roman"/>
@@ -446,23 +461,6 @@
       <w:pPr>
         <w:pStyle w:val="Normal"/>
         <w:jc w:val="center"/>
-        <w:rPr>
-          <w:rFonts w:ascii="Times New Roman" w:hAnsi="Times New Roman" w:cs="Times New Roman"/>
-          <w:sz w:val="28"/>
-          <w:szCs w:val="28"/>
-        </w:rPr>
-      </w:pPr>
-      <w:r>
-        <w:rPr>
-          <w:rFonts w:cs="Times New Roman" w:ascii="Times New Roman" w:hAnsi="Times New Roman"/>
-          <w:sz w:val="28"/>
-          <w:szCs w:val="28"/>
-        </w:rPr>
-      </w:r>
-    </w:p>
-    <w:p>
-      <w:pPr>
-        <w:pStyle w:val="Normal"/>
         <w:rPr>
           <w:rFonts w:ascii="Times New Roman" w:hAnsi="Times New Roman" w:cs="Times New Roman"/>
           <w:sz w:val="28"/>
@@ -669,86 +667,8 @@
               <w:szCs w:val="28"/>
               <w:u w:val="none"/>
             </w:rPr>
-            <w:t>1. А</w:t>
+            <w:t>1</w:t>
           </w:r>
-          <w:hyperlink w:anchor="_Toc233035272">
-            <w:r>
-              <w:rPr>
-                <w:webHidden/>
-                <w:rStyle w:val="IndexLink"/>
-                <w:rFonts w:ascii="Times New Roman" w:hAnsi="Times New Roman"/>
-                <w:vanish w:val="false"/>
-                <w:color w:themeColor="text1" w:val="000000"/>
-                <w:sz w:val="28"/>
-                <w:szCs w:val="28"/>
-                <w:u w:val="none"/>
-              </w:rPr>
-              <w:t>лгоритм функционирования приложения</w:t>
-            </w:r>
-            <w:r>
-              <w:rPr>
-                <w:rStyle w:val="IndexLink"/>
-                <w:rFonts w:ascii="Times New Roman" w:hAnsi="Times New Roman"/>
-                <w:vanish w:val="false"/>
-                <w:color w:themeColor="text1" w:val="000000"/>
-                <w:sz w:val="28"/>
-                <w:szCs w:val="28"/>
-              </w:rPr>
-              <w:tab/>
-            </w:r>
-            <w:r>
-              <w:rPr>
-                <w:webHidden/>
-              </w:rPr>
-              <w:fldChar w:fldCharType="begin"/>
-            </w:r>
-            <w:r>
-              <w:rPr>
-                <w:webHidden/>
-              </w:rPr>
-              <w:instrText xml:space="preserve">PAGEREF _Toc233035272 \h</w:instrText>
-            </w:r>
-            <w:r>
-              <w:rPr>
-                <w:webHidden/>
-              </w:rPr>
-              <w:fldChar w:fldCharType="separate"/>
-            </w:r>
-            <w:r>
-              <w:rPr>
-                <w:rStyle w:val="IndexLink"/>
-                <w:rFonts w:ascii="Times New Roman" w:hAnsi="Times New Roman"/>
-                <w:vanish w:val="false"/>
-                <w:color w:themeColor="text1" w:val="000000"/>
-                <w:sz w:val="28"/>
-                <w:szCs w:val="28"/>
-              </w:rPr>
-              <w:t>5</w:t>
-            </w:r>
-            <w:r>
-              <w:rPr>
-                <w:webHidden/>
-              </w:rPr>
-              <w:fldChar w:fldCharType="end"/>
-            </w:r>
-          </w:hyperlink>
-        </w:p>
-        <w:p>
-          <w:pPr>
-            <w:pStyle w:val="TOC1"/>
-            <w:tabs>
-              <w:tab w:val="clear" w:pos="708"/>
-              <w:tab w:val="right" w:pos="9345" w:leader="dot"/>
-            </w:tabs>
-            <w:rPr>
-              <w:rFonts w:ascii="Times New Roman" w:hAnsi="Times New Roman"/>
-              <w:color w:themeColor="text1" w:val="000000"/>
-              <w:kern w:val="2"/>
-              <w:sz w:val="28"/>
-              <w:szCs w:val="28"/>
-              <w14:ligatures w14:val="standardContextual"/>
-            </w:rPr>
-          </w:pPr>
           <w:r>
             <w:rPr>
               <w:rFonts w:ascii="Times New Roman" w:hAnsi="Times New Roman"/>
@@ -757,7 +677,7 @@
               <w:szCs w:val="28"/>
               <w:u w:val="none"/>
             </w:rPr>
-            <w:t xml:space="preserve">2. </w:t>
+            <w:t xml:space="preserve">. </w:t>
           </w:r>
           <w:hyperlink w:anchor="_Toc233035273">
             <w:r>
@@ -845,7 +765,17 @@
               <w:szCs w:val="28"/>
               <w:u w:val="none"/>
             </w:rPr>
-            <w:t xml:space="preserve">3. </w:t>
+            <w:t>2</w:t>
+          </w:r>
+          <w:r>
+            <w:rPr>
+              <w:rFonts w:ascii="Times New Roman" w:hAnsi="Times New Roman"/>
+              <w:color w:themeColor="text1" w:val="000000"/>
+              <w:sz w:val="28"/>
+              <w:szCs w:val="28"/>
+              <w:u w:val="none"/>
+            </w:rPr>
+            <w:t xml:space="preserve">. </w:t>
           </w:r>
           <w:hyperlink w:anchor="_Toc233035274">
             <w:r>
@@ -1598,36 +1528,17 @@
     <w:p>
       <w:pPr>
         <w:pStyle w:val="Normal"/>
-        <w:numPr>
-          <w:ilvl w:val="0"/>
-          <w:numId w:val="1"/>
-        </w:numPr>
         <w:spacing w:lineRule="auto" w:line="360"/>
-        <w:jc w:val="both"/>
-        <w:rPr/>
-      </w:pPr>
-      <w:r>
-        <w:rPr>
-          <w:rFonts w:cs="Times New Roman" w:ascii="Times New Roman" w:hAnsi="Times New Roman"/>
+        <w:ind w:firstLine="709"/>
+        <w:jc w:val="both"/>
+        <w:rPr>
+          <w:rFonts w:ascii="Times New Roman" w:hAnsi="Times New Roman" w:cs="Times New Roman"/>
           <w:b w:val="false"/>
           <w:bCs w:val="false"/>
           <w:color w:themeColor="text1" w:val="000000"/>
           <w:sz w:val="28"/>
           <w:szCs w:val="28"/>
         </w:rPr>
-        <w:t>Проанализировать предметную область, выделить ключевые механики жанра survival horror и сформулировать требования к разрабатываемому приложению.</w:t>
-      </w:r>
-    </w:p>
-    <w:p>
-      <w:pPr>
-        <w:pStyle w:val="Normal"/>
-        <w:numPr>
-          <w:ilvl w:val="0"/>
-          <w:numId w:val="1"/>
-        </w:numPr>
-        <w:spacing w:lineRule="auto" w:line="360"/>
-        <w:jc w:val="both"/>
-        <w:rPr/>
       </w:pPr>
       <w:r>
         <w:rPr>
@@ -1638,42 +1549,23 @@
           <w:sz w:val="28"/>
           <w:szCs w:val="28"/>
         </w:rPr>
-        <w:t>Спроектировать архитектуру приложения: иерархию сцен, систему состояний, взаимодействие между компонентами.</w:t>
-      </w:r>
-    </w:p>
-    <w:p>
-      <w:pPr>
-        <w:pStyle w:val="Normal"/>
-        <w:numPr>
-          <w:ilvl w:val="0"/>
-          <w:numId w:val="1"/>
-        </w:numPr>
+        <w:t>Проанализировать предметную область, выделить ключевые механики жанра survival horror и сформулировать требования к разрабатываемому приложению.</w:t>
+      </w:r>
+    </w:p>
+    <w:p>
+      <w:pPr>
+        <w:pStyle w:val="Normal"/>
         <w:spacing w:lineRule="auto" w:line="360"/>
-        <w:jc w:val="both"/>
-        <w:rPr/>
-      </w:pPr>
-      <w:r>
-        <w:rPr>
-          <w:rFonts w:cs="Times New Roman" w:ascii="Times New Roman" w:hAnsi="Times New Roman"/>
+        <w:ind w:firstLine="709"/>
+        <w:jc w:val="both"/>
+        <w:rPr>
+          <w:rFonts w:ascii="Times New Roman" w:hAnsi="Times New Roman" w:cs="Times New Roman"/>
           <w:b w:val="false"/>
           <w:bCs w:val="false"/>
           <w:color w:themeColor="text1" w:val="000000"/>
           <w:sz w:val="28"/>
           <w:szCs w:val="28"/>
         </w:rPr>
-        <w:t>Реализовать цикл день/ночь с переключением между режимом свободного перемещения и режимом наблюдения через камеры.</w:t>
-      </w:r>
-    </w:p>
-    <w:p>
-      <w:pPr>
-        <w:pStyle w:val="Normal"/>
-        <w:numPr>
-          <w:ilvl w:val="0"/>
-          <w:numId w:val="1"/>
-        </w:numPr>
-        <w:spacing w:lineRule="auto" w:line="360"/>
-        <w:jc w:val="both"/>
-        <w:rPr/>
       </w:pPr>
       <w:r>
         <w:rPr>
@@ -1684,53 +1576,7 @@
           <w:sz w:val="28"/>
           <w:szCs w:val="28"/>
         </w:rPr>
-        <w:t>Разработать систему искусственного интеллекта противников с конечным автоматом состояний (бездействие, продвижение, преследование, атака, исследование, бегство).</w:t>
-      </w:r>
-    </w:p>
-    <w:p>
-      <w:pPr>
-        <w:pStyle w:val="Normal"/>
-        <w:numPr>
-          <w:ilvl w:val="0"/>
-          <w:numId w:val="1"/>
-        </w:numPr>
-        <w:spacing w:lineRule="auto" w:line="360"/>
-        <w:jc w:val="both"/>
-        <w:rPr/>
-      </w:pPr>
-      <w:r>
-        <w:rPr>
-          <w:rFonts w:cs="Times New Roman" w:ascii="Times New Roman" w:hAnsi="Times New Roman"/>
-          <w:b w:val="false"/>
-          <w:bCs w:val="false"/>
-          <w:color w:themeColor="text1" w:val="000000"/>
-          <w:sz w:val="28"/>
-          <w:szCs w:val="28"/>
-        </w:rPr>
-        <w:t>Реализовать систему управления ресурсами (энергия, патроны для дробовика, ремкомплекты для камер, радио для отвлечения противников).</w:t>
-      </w:r>
-    </w:p>
-    <w:p>
-      <w:pPr>
-        <w:pStyle w:val="Normal"/>
-        <w:numPr>
-          <w:ilvl w:val="0"/>
-          <w:numId w:val="1"/>
-        </w:numPr>
-        <w:spacing w:lineRule="auto" w:line="360"/>
-        <w:jc w:val="both"/>
-        <w:rPr/>
-      </w:pPr>
-      <w:r>
-        <w:rPr>
-          <w:rFonts w:cs="Times New Roman" w:ascii="Times New Roman" w:hAnsi="Times New Roman"/>
-          <w:b w:val="false"/>
-          <w:bCs w:val="false"/>
-          <w:color w:themeColor="text1" w:val="000000"/>
-          <w:sz w:val="28"/>
-          <w:szCs w:val="28"/>
-        </w:rPr>
-        <w:t>Разработать графический интерфейс пользователя: главное меню, HUD с отображением времени и уровня энергии, экран окончания игры.</w:t>
+        <w:t>Спроектировать архитектуру приложения: иерархию сцен, систему состояний, взаимодействие между компонентами.</w:t>
       </w:r>
     </w:p>
     <w:p>
@@ -2250,11 +2096,8 @@
     <w:p>
       <w:pPr>
         <w:pStyle w:val="Normal"/>
-        <w:numPr>
-          <w:ilvl w:val="0"/>
-          <w:numId w:val="2"/>
-        </w:numPr>
         <w:spacing w:lineRule="auto" w:line="360"/>
+        <w:ind w:firstLine="851"/>
         <w:jc w:val="both"/>
         <w:rPr>
           <w:rFonts w:ascii="Times New Roman" w:hAnsi="Times New Roman" w:cs="Times New Roman"/>
@@ -2276,11 +2119,8 @@
     <w:p>
       <w:pPr>
         <w:pStyle w:val="Normal"/>
-        <w:numPr>
-          <w:ilvl w:val="0"/>
-          <w:numId w:val="2"/>
-        </w:numPr>
         <w:spacing w:lineRule="auto" w:line="360"/>
+        <w:ind w:firstLine="851"/>
         <w:jc w:val="both"/>
         <w:rPr>
           <w:rFonts w:ascii="Times New Roman" w:hAnsi="Times New Roman" w:cs="Times New Roman"/>
@@ -2302,11 +2142,8 @@
     <w:p>
       <w:pPr>
         <w:pStyle w:val="Normal"/>
-        <w:numPr>
-          <w:ilvl w:val="0"/>
-          <w:numId w:val="2"/>
-        </w:numPr>
         <w:spacing w:lineRule="auto" w:line="360"/>
+        <w:ind w:firstLine="851"/>
         <w:jc w:val="both"/>
         <w:rPr>
           <w:rFonts w:ascii="Times New Roman" w:hAnsi="Times New Roman" w:cs="Times New Roman"/>
@@ -2328,11 +2165,8 @@
     <w:p>
       <w:pPr>
         <w:pStyle w:val="Normal"/>
-        <w:numPr>
-          <w:ilvl w:val="0"/>
-          <w:numId w:val="2"/>
-        </w:numPr>
         <w:spacing w:lineRule="auto" w:line="360"/>
+        <w:ind w:firstLine="851"/>
         <w:jc w:val="both"/>
         <w:rPr>
           <w:rFonts w:ascii="Times New Roman" w:hAnsi="Times New Roman" w:cs="Times New Roman"/>
@@ -2354,11 +2188,8 @@
     <w:p>
       <w:pPr>
         <w:pStyle w:val="Normal"/>
-        <w:numPr>
-          <w:ilvl w:val="0"/>
-          <w:numId w:val="2"/>
-        </w:numPr>
         <w:spacing w:lineRule="auto" w:line="360"/>
+        <w:ind w:firstLine="851"/>
         <w:jc w:val="both"/>
         <w:rPr>
           <w:rFonts w:ascii="Times New Roman" w:hAnsi="Times New Roman" w:cs="Times New Roman"/>
@@ -2380,11 +2211,8 @@
     <w:p>
       <w:pPr>
         <w:pStyle w:val="Normal"/>
-        <w:numPr>
-          <w:ilvl w:val="0"/>
-          <w:numId w:val="2"/>
-        </w:numPr>
         <w:spacing w:lineRule="auto" w:line="360"/>
+        <w:ind w:firstLine="851"/>
         <w:jc w:val="both"/>
         <w:rPr>
           <w:rFonts w:ascii="Times New Roman" w:hAnsi="Times New Roman" w:cs="Times New Roman"/>
@@ -2406,11 +2234,8 @@
     <w:p>
       <w:pPr>
         <w:pStyle w:val="Normal"/>
-        <w:numPr>
-          <w:ilvl w:val="0"/>
-          <w:numId w:val="2"/>
-        </w:numPr>
         <w:spacing w:lineRule="auto" w:line="360"/>
+        <w:ind w:firstLine="851"/>
         <w:jc w:val="both"/>
         <w:rPr>
           <w:rFonts w:ascii="Times New Roman" w:hAnsi="Times New Roman" w:cs="Times New Roman"/>
@@ -2427,28 +2252,6 @@
           <w:szCs w:val="28"/>
         </w:rPr>
         <w:t>Восстановление энергии — при полном истощении энергии система камер отключается, игрок принудительно переводится в режим свободного перемещения. Энергию можно восстановить, активировав рубильник в помещении охраны. Процесс восстановления энергии занимает несколько секунд, в течение которых игрок уязвим.</w:t>
-      </w:r>
-    </w:p>
-    <w:p>
-      <w:pPr>
-        <w:pStyle w:val="Normal"/>
-        <w:spacing w:lineRule="auto" w:line="360"/>
-        <w:ind w:firstLine="851"/>
-        <w:jc w:val="both"/>
-        <w:rPr>
-          <w:rFonts w:ascii="Times New Roman" w:hAnsi="Times New Roman" w:cs="Times New Roman"/>
-          <w:color w:themeColor="text1" w:val="000000"/>
-          <w:sz w:val="28"/>
-          <w:szCs w:val="28"/>
-        </w:rPr>
-      </w:pPr>
-      <w:r>
-        <w:rPr>
-          <w:rFonts w:cs="Times New Roman" w:ascii="Times New Roman" w:hAnsi="Times New Roman"/>
-          <w:color w:themeColor="text1" w:val="000000"/>
-          <w:sz w:val="28"/>
-          <w:szCs w:val="28"/>
-        </w:rPr>
       </w:r>
     </w:p>
     <w:p>
@@ -2588,50 +2391,6 @@
     </w:p>
     <w:p>
       <w:pPr>
-        <w:pStyle w:val="ListParagraph"/>
-        <w:spacing w:lineRule="auto" w:line="360"/>
-        <w:ind w:left="0"/>
-        <w:jc w:val="center"/>
-        <w:rPr>
-          <w:rFonts w:ascii="Times New Roman" w:hAnsi="Times New Roman" w:cs="Times New Roman"/>
-          <w:color w:themeColor="text1" w:val="000000"/>
-          <w:sz w:val="28"/>
-          <w:szCs w:val="28"/>
-        </w:rPr>
-      </w:pPr>
-      <w:r>
-        <w:rPr>
-          <w:rFonts w:cs="Times New Roman" w:ascii="Times New Roman" w:hAnsi="Times New Roman"/>
-          <w:color w:themeColor="text1" w:val="000000"/>
-          <w:sz w:val="28"/>
-          <w:szCs w:val="28"/>
-        </w:rPr>
-      </w:r>
-    </w:p>
-    <w:p>
-      <w:pPr>
-        <w:pStyle w:val="ListParagraph"/>
-        <w:spacing w:lineRule="auto" w:line="360"/>
-        <w:ind w:left="0"/>
-        <w:jc w:val="center"/>
-        <w:rPr>
-          <w:rFonts w:ascii="Times New Roman" w:hAnsi="Times New Roman" w:cs="Times New Roman"/>
-          <w:color w:themeColor="text1" w:val="000000"/>
-          <w:sz w:val="28"/>
-          <w:szCs w:val="28"/>
-        </w:rPr>
-      </w:pPr>
-      <w:r>
-        <w:rPr>
-          <w:rFonts w:cs="Times New Roman" w:ascii="Times New Roman" w:hAnsi="Times New Roman"/>
-          <w:color w:themeColor="text1" w:val="000000"/>
-          <w:sz w:val="28"/>
-          <w:szCs w:val="28"/>
-        </w:rPr>
-      </w:r>
-    </w:p>
-    <w:p>
-      <w:pPr>
         <w:pStyle w:val="Heading1"/>
         <w:spacing w:lineRule="auto" w:line="360"/>
         <w:jc w:val="center"/>
@@ -2644,7 +2403,6 @@
           <w:szCs w:val="28"/>
         </w:rPr>
       </w:pPr>
-      <w:bookmarkStart w:id="3" w:name="_Toc233035273"/>
       <w:r>
         <w:rPr>
           <w:rFonts w:cs="Times New Roman" w:ascii="Times New Roman" w:hAnsi="Times New Roman"/>
@@ -2654,6 +2412,18 @@
           <w:sz w:val="28"/>
           <w:szCs w:val="28"/>
         </w:rPr>
+        <w:t xml:space="preserve">1 </w:t>
+      </w:r>
+      <w:bookmarkStart w:id="3" w:name="_Toc233035273"/>
+      <w:r>
+        <w:rPr>
+          <w:rFonts w:cs="Times New Roman" w:ascii="Times New Roman" w:hAnsi="Times New Roman"/>
+          <w:b/>
+          <w:bCs/>
+          <w:color w:themeColor="text1" w:val="000000"/>
+          <w:sz w:val="28"/>
+          <w:szCs w:val="28"/>
+        </w:rPr>
         <w:t>РАЗРАБОТКА АРХИТЕКТУРЫ И ГРАФИЧЕСКОГО ИНТЕРФЕЙСА ПРИЛОЖЕНИЯ</w:t>
       </w:r>
       <w:bookmarkEnd w:id="3"/>
@@ -2676,7 +2446,7 @@
           <w:sz w:val="28"/>
           <w:szCs w:val="28"/>
         </w:rPr>
-        <w:t>На начальном этапе сформулированы основные требования к программе, которые носят функциональный и нефункциональный характер. Приложение должно содержать главное меню для запуска игры и выхода, игровую сцену с циклической сменой дня и ночи, систему камер видеонаблюдения с возможностью переключения, систему искусственного интеллекта противников, систему управления ресурсами, поддержку трёхмерной графики и физического движка.</w:t>
+        <w:t>На начальном этапе сформулированы основные требования к программе, которые носят функциональный и нефункциональный характер. Приложение должно содержать главное меню для запуска игры и выхода, игровую сцену с циклической сменой дня и ночи, систему камер видеонаблюдения с возможностью переключения, систему искусственного интеллекта противников, систему управления ресурсами, поддержку трёхмерной графики и физического движка. Были выделены следующие задачи:</w:t>
       </w:r>
     </w:p>
     <w:p>
@@ -2694,10 +2464,13 @@
       <w:r>
         <w:rPr>
           <w:rFonts w:cs="Times New Roman" w:ascii="Times New Roman" w:hAnsi="Times New Roman"/>
-          <w:sz w:val="28"/>
-          <w:szCs w:val="28"/>
-        </w:rPr>
-        <w:t>В качестве среды разработки выбран Godot 4.6 с использованием языка GDScript. Godot представляет собой свободный кроссплатформенный движок с открытым исходным кодом, поддерживающий как 2D-, так и 3D-графику. Выбор обусловлен лёгкостью освоения, встроенным редактором сцен, гибкой системой сигналов и слотов, а также поддержкой шейдеров и современных графических возможностей, включая физический движок Jolt Physics.</w:t>
+          <w:b w:val="false"/>
+          <w:bCs w:val="false"/>
+          <w:color w:themeColor="text1" w:val="000000"/>
+          <w:sz w:val="28"/>
+          <w:szCs w:val="28"/>
+        </w:rPr>
+        <w:t>Реализовать цикл день/ночь с переключением между режимом свободного перемещения и режимом наблюдения через камеры.</w:t>
       </w:r>
     </w:p>
     <w:p>
@@ -2715,10 +2488,13 @@
       <w:r>
         <w:rPr>
           <w:rFonts w:cs="Times New Roman" w:ascii="Times New Roman" w:hAnsi="Times New Roman"/>
-          <w:sz w:val="28"/>
-          <w:szCs w:val="28"/>
-        </w:rPr>
-        <w:t>Программа реализована с использованием модульной архитектуры на основе иерархии сцен. Центральным элементом является GameModeManager (синглтон), управляющий переключением фаз дня и ночи, энергопотреблением и состоянием игры. Основные сцены: main_menu.tscn (главное меню), main.tscn (основная игровая сцена), game_over.tscn (экран окончания игры).</w:t>
+          <w:b w:val="false"/>
+          <w:bCs w:val="false"/>
+          <w:color w:themeColor="text1" w:val="000000"/>
+          <w:sz w:val="28"/>
+          <w:szCs w:val="28"/>
+        </w:rPr>
+        <w:t>Разработать систему искусственного интеллекта противников с конечным автоматом состояний (бездействие, продвижение, преследование, атака, исследование, бегство).</w:t>
       </w:r>
     </w:p>
     <w:p>
@@ -2736,10 +2512,37 @@
       <w:r>
         <w:rPr>
           <w:rFonts w:cs="Times New Roman" w:ascii="Times New Roman" w:hAnsi="Times New Roman"/>
-          <w:sz w:val="28"/>
-          <w:szCs w:val="28"/>
-        </w:rPr>
-        <w:t>Игровая сцена main.tscn содержит следующие ключевые компоненты: FreeroamController (управление игроком в режиме свободного перемещения с помощью клавиш WASD), OfficeController (управление камерой в помещении охраны с помощью перемещения мыши к краям экрана), CameraSystem (система управления пятью камерами видеонаблюдения через SubViewport), AI_Base (базовый класс противника с конечным автоматом состояний), Room (комнаты с системой бронирования мест для противников) и HighlightManager (система подсветки интерактивных объектов с помощью контурных шейдеров).</w:t>
+          <w:b w:val="false"/>
+          <w:bCs w:val="false"/>
+          <w:color w:themeColor="text1" w:val="000000"/>
+          <w:sz w:val="28"/>
+          <w:szCs w:val="28"/>
+        </w:rPr>
+        <w:t>Реализовать систему управления ресурсами (энергия, патроны для дробовика, ремкомплекты для камер, радио для отвлечения противников).</w:t>
+      </w:r>
+    </w:p>
+    <w:p>
+      <w:pPr>
+        <w:pStyle w:val="Normal"/>
+        <w:widowControl/>
+        <w:suppressAutoHyphens w:val="true"/>
+        <w:bidi w:val="0"/>
+        <w:spacing w:lineRule="auto" w:line="360" w:before="0" w:after="160"/>
+        <w:ind w:firstLine="720" w:left="0" w:right="0"/>
+        <w:jc w:val="both"/>
+        <w:rPr>
+          <w:rFonts w:ascii="Times New Roman" w:hAnsi="Times New Roman" w:cs="Times New Roman"/>
+          <w:sz w:val="28"/>
+          <w:szCs w:val="28"/>
+        </w:rPr>
+      </w:pPr>
+      <w:r>
+        <w:rPr>
+          <w:b w:val="false"/>
+          <w:bCs w:val="false"/>
+          <w:color w:themeColor="text1" w:val="000000"/>
+        </w:rPr>
+        <w:t>Разработать графический интерфейс пользователя: главное меню, HUD с отображением времени и уровня энергии, экран окончания игры.</w:t>
       </w:r>
     </w:p>
     <w:p>
@@ -2760,6 +2563,7 @@
           <w:sz w:val="28"/>
           <w:szCs w:val="28"/>
         </w:rPr>
+        <w:t>В качестве среды разработки выбран Godot 4.6 с использованием языка GDScript. Godot представляет собой свободный кроссплатформенный движок с открытым исходным кодом, поддерживающий как 2D-, так и 3D-графику. Выбор обусловлен лёгкостью освоения, встроенным редактором сцен, гибкой системой сигналов и слотов, а также поддержкой шейдеров и современных графических возможностей, включая физический движок Jolt Physics.</w:t>
       </w:r>
     </w:p>
     <w:p>
@@ -2780,7 +2584,7 @@
           <w:sz w:val="28"/>
           <w:szCs w:val="28"/>
         </w:rPr>
-        <w:t>Граф комнат реализован в виде связного списка, где каждая комната имеет массив соседей и расстояние до кабинета охраны. Противники используют этот граф для навигации: в режиме продвижения они выбирают соседнюю комнату, расположенную ближе к кабинету. Каждая комната содержит точки появления (spots), которые бронируются противниками, предотвращая пересечение нескольких противников в одной точке.</w:t>
+        <w:t>Программа реализована с использованием модульной архитектуры на основе иерархии сцен. Центральным элементом является GameModeManager (синглтон), управляющий переключением фаз дня и ночи, энергопотреблением и состоянием игры. Основные сцены: main_menu.tscn (главное меню), main.tscn (основная игровая сцена), game_over.tscn (экран окончания игры).</w:t>
       </w:r>
     </w:p>
     <w:p>
@@ -2801,6 +2605,7 @@
           <w:sz w:val="28"/>
           <w:szCs w:val="28"/>
         </w:rPr>
+        <w:t>Игровая сцена main.tscn содержит следующие ключевые компоненты: FreeroamController (управление игроком в режиме свободного перемещения с помощью клавиш WASD), OfficeController (управление камерой в помещении охраны с помощью перемещения мыши к краям экрана), CameraSystem (система управления пятью камерами видеонаблюдения через SubViewport), AI_Base (базовый класс противника с конечным автоматом состояний), Room (комнаты с системой бронирования мест для противников) и HighlightManager (система подсветки интерактивных объектов с помощью контурных шейдеров).</w:t>
       </w:r>
     </w:p>
     <w:p>
@@ -2821,7 +2626,6 @@
           <w:sz w:val="28"/>
           <w:szCs w:val="28"/>
         </w:rPr>
-        <w:t>Система камер видеонаблюдения основана на SubViewport, каждый из которых содержит отдельную камеру, направленную на соответствующую комнату. Изображение камер отображается на мониторе в помещении охраны через ShaderMaterial, использующий шейдер monitor_screen.gdshader. На изображение каждой камеры накладывается эффект VHS-помех (vhs_shader.gdshader), имитирующий аналоговое видеонаблюдение: цветовые искажения, шумы, строчную развёртку и виньетирование.</w:t>
       </w:r>
     </w:p>
     <w:p>
@@ -2842,6 +2646,7 @@
           <w:sz w:val="28"/>
           <w:szCs w:val="28"/>
         </w:rPr>
+        <w:t>Граф комнат реализован в виде связного списка, где каждая комната имеет массив соседей и расстояние до кабинета охраны. Противники используют этот граф для навигации: в режиме продвижения они выбирают соседнюю комнату, расположенную ближе к кабинету. Каждая комната содержит точки появления (spots), которые бронируются противниками, предотвращая пересечение нескольких противников в одной точке.</w:t>
       </w:r>
     </w:p>
     <w:p>
@@ -2862,7 +2667,84 @@
           <w:sz w:val="28"/>
           <w:szCs w:val="28"/>
         </w:rPr>
-        <w:t>Таким образом, архитектура обеспечивает чёткое разделение компонентов, а интерфейс сочетает информативность и погружение в игровую атмосферу.</w:t>
+      </w:r>
+    </w:p>
+    <w:p>
+      <w:pPr>
+        <w:pStyle w:val="Normal"/>
+        <w:spacing w:lineRule="auto" w:line="360"/>
+        <w:ind w:firstLine="709"/>
+        <w:jc w:val="both"/>
+        <w:rPr>
+          <w:rFonts w:ascii="Times New Roman" w:hAnsi="Times New Roman" w:cs="Times New Roman"/>
+          <w:sz w:val="28"/>
+          <w:szCs w:val="28"/>
+        </w:rPr>
+      </w:pPr>
+      <w:r>
+        <w:rPr>
+          <w:rFonts w:cs="Times New Roman" w:ascii="Times New Roman" w:hAnsi="Times New Roman"/>
+          <w:sz w:val="28"/>
+          <w:szCs w:val="28"/>
+        </w:rPr>
+        <w:t>Система камер видеонаблюдения основана на SubViewport, каждый из которых содержит отдельную камеру, направленную на соответствующую комнату. Изображение камер отображается на мониторе в помещении охраны через ShaderMaterial, использующий шейдер monitor_screen.gdshader. На изображение каждой камеры накладывается эффект VHS-помех (vhs_shader.gdshader), имитирующий аналоговое видеонаблюдение: цветовые искажения, шумы, строчную развёртку и виньетирование.</w:t>
+      </w:r>
+    </w:p>
+    <w:p>
+      <w:pPr>
+        <w:pStyle w:val="Normal"/>
+        <w:spacing w:lineRule="auto" w:line="360"/>
+        <w:ind w:firstLine="709"/>
+        <w:jc w:val="both"/>
+        <w:rPr>
+          <w:rFonts w:ascii="Times New Roman" w:hAnsi="Times New Roman" w:cs="Times New Roman"/>
+          <w:sz w:val="28"/>
+          <w:szCs w:val="28"/>
+        </w:rPr>
+      </w:pPr>
+      <w:r>
+        <w:rPr>
+          <w:rFonts w:cs="Times New Roman" w:ascii="Times New Roman" w:hAnsi="Times New Roman"/>
+          <w:sz w:val="28"/>
+          <w:szCs w:val="28"/>
+        </w:rPr>
+      </w:r>
+    </w:p>
+    <w:p>
+      <w:pPr>
+        <w:pStyle w:val="Normal"/>
+        <w:spacing w:lineRule="auto" w:line="360"/>
+        <w:ind w:firstLine="709"/>
+        <w:jc w:val="both"/>
+        <w:rPr>
+          <w:rFonts w:ascii="Times New Roman" w:hAnsi="Times New Roman" w:cs="Times New Roman"/>
+          <w:sz w:val="28"/>
+          <w:szCs w:val="28"/>
+        </w:rPr>
+      </w:pPr>
+      <w:r>
+        <w:rPr>
+          <w:rFonts w:cs="Times New Roman" w:ascii="Times New Roman" w:hAnsi="Times New Roman"/>
+          <w:sz w:val="28"/>
+          <w:szCs w:val="28"/>
+        </w:rPr>
+        <w:t xml:space="preserve">Таким образом, архитектура обеспечивает чёткое разделение компонентов </w:t>
+      </w:r>
+      <w:r>
+        <w:rPr>
+          <w:rFonts w:cs="Times New Roman" w:ascii="Times New Roman" w:hAnsi="Times New Roman"/>
+          <w:sz w:val="28"/>
+          <w:szCs w:val="28"/>
+        </w:rPr>
+        <w:t>(в соответствии с ООП),</w:t>
+      </w:r>
+      <w:r>
+        <w:rPr>
+          <w:rFonts w:cs="Times New Roman" w:ascii="Times New Roman" w:hAnsi="Times New Roman"/>
+          <w:sz w:val="28"/>
+          <w:szCs w:val="28"/>
+        </w:rPr>
+        <w:t xml:space="preserve"> а интерфейс сочетает информативность и погружение в игровую атмосферу.</w:t>
       </w:r>
     </w:p>
     <w:p>
@@ -2879,6 +2761,17 @@
           <w:szCs w:val="28"/>
         </w:rPr>
       </w:pPr>
+      <w:r>
+        <w:rPr>
+          <w:rFonts w:cs="Times New Roman" w:ascii="Times New Roman" w:hAnsi="Times New Roman"/>
+          <w:b/>
+          <w:bCs/>
+          <w:color w:themeColor="text1" w:val="000000"/>
+          <w:sz w:val="28"/>
+          <w:szCs w:val="28"/>
+        </w:rPr>
+        <w:t xml:space="preserve">2 </w:t>
+      </w:r>
       <w:bookmarkStart w:id="4" w:name="_Toc233035274"/>
       <w:r>
         <w:rPr>
@@ -3238,46 +3131,6 @@
           <w:sz w:val="28"/>
           <w:szCs w:val="28"/>
         </w:rPr>
-      </w:r>
-    </w:p>
-    <w:p>
-      <w:pPr>
-        <w:pStyle w:val="Normal"/>
-        <w:spacing w:lineRule="auto" w:line="360"/>
-        <w:ind w:firstLine="709"/>
-        <w:jc w:val="both"/>
-        <w:rPr>
-          <w:rFonts w:ascii="Times New Roman" w:hAnsi="Times New Roman" w:cs="Times New Roman"/>
-          <w:sz w:val="28"/>
-          <w:szCs w:val="28"/>
-        </w:rPr>
-      </w:pPr>
-      <w:r>
-        <w:rPr>
-          <w:rFonts w:cs="Times New Roman" w:ascii="Times New Roman" w:hAnsi="Times New Roman"/>
-          <w:sz w:val="28"/>
-          <w:szCs w:val="28"/>
-        </w:rPr>
-      </w:r>
-    </w:p>
-    <w:p>
-      <w:pPr>
-        <w:pStyle w:val="Normal"/>
-        <w:spacing w:lineRule="auto" w:line="360"/>
-        <w:ind w:firstLine="709"/>
-        <w:jc w:val="both"/>
-        <w:rPr>
-          <w:rFonts w:ascii="Times New Roman" w:hAnsi="Times New Roman" w:cs="Times New Roman"/>
-          <w:sz w:val="28"/>
-          <w:szCs w:val="28"/>
-        </w:rPr>
-      </w:pPr>
-      <w:r>
-        <w:rPr>
-          <w:rFonts w:cs="Times New Roman" w:ascii="Times New Roman" w:hAnsi="Times New Roman"/>
-          <w:sz w:val="28"/>
-          <w:szCs w:val="28"/>
-        </w:rPr>
         <w:t>Класс AI_Base является центральным элементом системы ИИ, унаследован от CharacterBody3D. Противник использует NavigationAgent3D для навигации по навигационной сетке (NavMesh), построенной на основе трёхмерной модели уровня. NavMesh генерируется автоматически на этапе разработки через редактор Godot: для этого используются узлы NavigationRegion3D, на которых размещается геометрия уровня. Навигация осуществляется по точкам: противник получает целевую комнату (target_room), находит доступную точку появления (spot) через метод get_available_spot() и устанавливает её как цель навигационного агента через nav_agent.set_target_position(). При движении в _physics_process(delta) происходит плавное вращение в сторону следующей точки маршрута через метод _face_direction(delta), который использует сферическую интерполяцию (slerp) для поворота модели. По прибытии в целевую комнату генерируется сигнал on_reached_target, который обрабатывается текущим состоянием для принятия решения о дальнейших действиях.</w:t>
       </w:r>
     </w:p>
@@ -3747,7 +3600,15 @@
           <w:sz w:val="28"/>
           <w:szCs w:val="28"/>
         </w:rPr>
-        <w:t>Таким образом, игра полностью реализует задуманную механику. Все компоненты приложения связаны через сигналы и слоты, что обеспечивает слабую связанность модулей и простоту расширения функциональности.</w:t>
+        <w:t>Таким образом,</w:t>
+      </w:r>
+      <w:r>
+        <w:rPr>
+          <w:rFonts w:cs="Times New Roman" w:ascii="Times New Roman" w:hAnsi="Times New Roman"/>
+          <w:sz w:val="28"/>
+          <w:szCs w:val="28"/>
+        </w:rPr>
+        <w:t xml:space="preserve"> все компоненты приложения связаны через сигналы и слоты, что обеспечивает слабую связанность модулей и простоту расширения функциональности.</w:t>
       </w:r>
     </w:p>
     <w:p>
@@ -12194,7 +12055,7 @@
         </w:r>
         <w:r>
           <w:rPr/>
-          <w:t>3</w:t>
+          <w:t>18</w:t>
         </w:r>
         <w:r>
           <w:rPr/>
@@ -12227,413 +12088,6 @@
     </w:r>
   </w:p>
 </w:ftr>
-</file>
-
-<file path=word/numbering.xml><?xml version="1.0" encoding="utf-8"?>
-<w:numbering xmlns:w="http://schemas.openxmlformats.org/wordprocessingml/2006/main" xmlns:o="urn:schemas-microsoft-com:office:office" xmlns:r="http://schemas.openxmlformats.org/officeDocument/2006/relationships" xmlns:v="urn:schemas-microsoft-com:vml" xmlns:mc="http://schemas.openxmlformats.org/markup-compatibility/2006" xmlns:w14="http://schemas.microsoft.com/office/word/2010/wordml" mc:Ignorable="w14">
-  <w:abstractNum w:abstractNumId="1">
-    <w:lvl w:ilvl="0">
-      <w:start w:val="1"/>
-      <w:numFmt w:val="bullet"/>
-      <w:lvlText w:val=""/>
-      <w:lvlJc w:val="left"/>
-      <w:pPr>
-        <w:tabs>
-          <w:tab w:val="num" w:pos="720"/>
-        </w:tabs>
-        <w:ind w:left="720" w:hanging="360"/>
-      </w:pPr>
-      <w:rPr>
-        <w:rFonts w:ascii="Symbol" w:hAnsi="Symbol" w:cs="Symbol" w:hint="default"/>
-      </w:rPr>
-    </w:lvl>
-    <w:lvl w:ilvl="1">
-      <w:start w:val="1"/>
-      <w:numFmt w:val="bullet"/>
-      <w:lvlText w:val=""/>
-      <w:lvlJc w:val="left"/>
-      <w:pPr>
-        <w:tabs>
-          <w:tab w:val="num" w:pos="1080"/>
-        </w:tabs>
-        <w:ind w:left="1080" w:hanging="360"/>
-      </w:pPr>
-      <w:rPr>
-        <w:rFonts w:ascii="Symbol" w:hAnsi="Symbol" w:cs="Symbol" w:hint="default"/>
-      </w:rPr>
-    </w:lvl>
-    <w:lvl w:ilvl="2">
-      <w:start w:val="1"/>
-      <w:numFmt w:val="bullet"/>
-      <w:lvlText w:val=""/>
-      <w:lvlJc w:val="left"/>
-      <w:pPr>
-        <w:tabs>
-          <w:tab w:val="num" w:pos="1440"/>
-        </w:tabs>
-        <w:ind w:left="1440" w:hanging="360"/>
-      </w:pPr>
-      <w:rPr>
-        <w:rFonts w:ascii="Symbol" w:hAnsi="Symbol" w:cs="Symbol" w:hint="default"/>
-      </w:rPr>
-    </w:lvl>
-    <w:lvl w:ilvl="3">
-      <w:start w:val="1"/>
-      <w:numFmt w:val="bullet"/>
-      <w:lvlText w:val=""/>
-      <w:lvlJc w:val="left"/>
-      <w:pPr>
-        <w:tabs>
-          <w:tab w:val="num" w:pos="1800"/>
-        </w:tabs>
-        <w:ind w:left="1800" w:hanging="360"/>
-      </w:pPr>
-      <w:rPr>
-        <w:rFonts w:ascii="Symbol" w:hAnsi="Symbol" w:cs="Symbol" w:hint="default"/>
-      </w:rPr>
-    </w:lvl>
-    <w:lvl w:ilvl="4">
-      <w:start w:val="1"/>
-      <w:numFmt w:val="bullet"/>
-      <w:lvlText w:val=""/>
-      <w:lvlJc w:val="left"/>
-      <w:pPr>
-        <w:tabs>
-          <w:tab w:val="num" w:pos="2160"/>
-        </w:tabs>
-        <w:ind w:left="2160" w:hanging="360"/>
-      </w:pPr>
-      <w:rPr>
-        <w:rFonts w:ascii="Symbol" w:hAnsi="Symbol" w:cs="Symbol" w:hint="default"/>
-      </w:rPr>
-    </w:lvl>
-    <w:lvl w:ilvl="5">
-      <w:start w:val="1"/>
-      <w:numFmt w:val="bullet"/>
-      <w:lvlText w:val=""/>
-      <w:lvlJc w:val="left"/>
-      <w:pPr>
-        <w:tabs>
-          <w:tab w:val="num" w:pos="2520"/>
-        </w:tabs>
-        <w:ind w:left="2520" w:hanging="360"/>
-      </w:pPr>
-      <w:rPr>
-        <w:rFonts w:ascii="Symbol" w:hAnsi="Symbol" w:cs="Symbol" w:hint="default"/>
-      </w:rPr>
-    </w:lvl>
-    <w:lvl w:ilvl="6">
-      <w:start w:val="1"/>
-      <w:numFmt w:val="bullet"/>
-      <w:lvlText w:val=""/>
-      <w:lvlJc w:val="left"/>
-      <w:pPr>
-        <w:tabs>
-          <w:tab w:val="num" w:pos="2880"/>
-        </w:tabs>
-        <w:ind w:left="2880" w:hanging="360"/>
-      </w:pPr>
-      <w:rPr>
-        <w:rFonts w:ascii="Symbol" w:hAnsi="Symbol" w:cs="Symbol" w:hint="default"/>
-      </w:rPr>
-    </w:lvl>
-    <w:lvl w:ilvl="7">
-      <w:start w:val="1"/>
-      <w:numFmt w:val="bullet"/>
-      <w:lvlText w:val=""/>
-      <w:lvlJc w:val="left"/>
-      <w:pPr>
-        <w:tabs>
-          <w:tab w:val="num" w:pos="3240"/>
-        </w:tabs>
-        <w:ind w:left="3240" w:hanging="360"/>
-      </w:pPr>
-      <w:rPr>
-        <w:rFonts w:ascii="Symbol" w:hAnsi="Symbol" w:cs="Symbol" w:hint="default"/>
-      </w:rPr>
-    </w:lvl>
-    <w:lvl w:ilvl="8">
-      <w:start w:val="1"/>
-      <w:numFmt w:val="bullet"/>
-      <w:lvlText w:val=""/>
-      <w:lvlJc w:val="left"/>
-      <w:pPr>
-        <w:tabs>
-          <w:tab w:val="num" w:pos="3600"/>
-        </w:tabs>
-        <w:ind w:left="3600" w:hanging="360"/>
-      </w:pPr>
-      <w:rPr>
-        <w:rFonts w:ascii="Symbol" w:hAnsi="Symbol" w:cs="Symbol" w:hint="default"/>
-      </w:rPr>
-    </w:lvl>
-  </w:abstractNum>
-  <w:abstractNum w:abstractNumId="2">
-    <w:lvl w:ilvl="0">
-      <w:start w:val="1"/>
-      <w:numFmt w:val="bullet"/>
-      <w:lvlText w:val=""/>
-      <w:lvlJc w:val="left"/>
-      <w:pPr>
-        <w:tabs>
-          <w:tab w:val="num" w:pos="720"/>
-        </w:tabs>
-        <w:ind w:left="720" w:hanging="360"/>
-      </w:pPr>
-      <w:rPr>
-        <w:rFonts w:ascii="Symbol" w:hAnsi="Symbol" w:cs="Symbol" w:hint="default"/>
-      </w:rPr>
-    </w:lvl>
-    <w:lvl w:ilvl="1">
-      <w:start w:val="1"/>
-      <w:numFmt w:val="bullet"/>
-      <w:lvlText w:val=""/>
-      <w:lvlJc w:val="left"/>
-      <w:pPr>
-        <w:tabs>
-          <w:tab w:val="num" w:pos="1080"/>
-        </w:tabs>
-        <w:ind w:left="1080" w:hanging="360"/>
-      </w:pPr>
-      <w:rPr>
-        <w:rFonts w:ascii="Symbol" w:hAnsi="Symbol" w:cs="Symbol" w:hint="default"/>
-      </w:rPr>
-    </w:lvl>
-    <w:lvl w:ilvl="2">
-      <w:start w:val="1"/>
-      <w:numFmt w:val="bullet"/>
-      <w:lvlText w:val=""/>
-      <w:lvlJc w:val="left"/>
-      <w:pPr>
-        <w:tabs>
-          <w:tab w:val="num" w:pos="1440"/>
-        </w:tabs>
-        <w:ind w:left="1440" w:hanging="360"/>
-      </w:pPr>
-      <w:rPr>
-        <w:rFonts w:ascii="Symbol" w:hAnsi="Symbol" w:cs="Symbol" w:hint="default"/>
-      </w:rPr>
-    </w:lvl>
-    <w:lvl w:ilvl="3">
-      <w:start w:val="1"/>
-      <w:numFmt w:val="bullet"/>
-      <w:lvlText w:val=""/>
-      <w:lvlJc w:val="left"/>
-      <w:pPr>
-        <w:tabs>
-          <w:tab w:val="num" w:pos="1800"/>
-        </w:tabs>
-        <w:ind w:left="1800" w:hanging="360"/>
-      </w:pPr>
-      <w:rPr>
-        <w:rFonts w:ascii="Symbol" w:hAnsi="Symbol" w:cs="Symbol" w:hint="default"/>
-      </w:rPr>
-    </w:lvl>
-    <w:lvl w:ilvl="4">
-      <w:start w:val="1"/>
-      <w:numFmt w:val="bullet"/>
-      <w:lvlText w:val=""/>
-      <w:lvlJc w:val="left"/>
-      <w:pPr>
-        <w:tabs>
-          <w:tab w:val="num" w:pos="2160"/>
-        </w:tabs>
-        <w:ind w:left="2160" w:hanging="360"/>
-      </w:pPr>
-      <w:rPr>
-        <w:rFonts w:ascii="Symbol" w:hAnsi="Symbol" w:cs="Symbol" w:hint="default"/>
-      </w:rPr>
-    </w:lvl>
-    <w:lvl w:ilvl="5">
-      <w:start w:val="1"/>
-      <w:numFmt w:val="bullet"/>
-      <w:lvlText w:val=""/>
-      <w:lvlJc w:val="left"/>
-      <w:pPr>
-        <w:tabs>
-          <w:tab w:val="num" w:pos="2520"/>
-        </w:tabs>
-        <w:ind w:left="2520" w:hanging="360"/>
-      </w:pPr>
-      <w:rPr>
-        <w:rFonts w:ascii="Symbol" w:hAnsi="Symbol" w:cs="Symbol" w:hint="default"/>
-      </w:rPr>
-    </w:lvl>
-    <w:lvl w:ilvl="6">
-      <w:start w:val="1"/>
-      <w:numFmt w:val="bullet"/>
-      <w:lvlText w:val=""/>
-      <w:lvlJc w:val="left"/>
-      <w:pPr>
-        <w:tabs>
-          <w:tab w:val="num" w:pos="2880"/>
-        </w:tabs>
-        <w:ind w:left="2880" w:hanging="360"/>
-      </w:pPr>
-      <w:rPr>
-        <w:rFonts w:ascii="Symbol" w:hAnsi="Symbol" w:cs="Symbol" w:hint="default"/>
-      </w:rPr>
-    </w:lvl>
-    <w:lvl w:ilvl="7">
-      <w:start w:val="1"/>
-      <w:numFmt w:val="bullet"/>
-      <w:lvlText w:val=""/>
-      <w:lvlJc w:val="left"/>
-      <w:pPr>
-        <w:tabs>
-          <w:tab w:val="num" w:pos="3240"/>
-        </w:tabs>
-        <w:ind w:left="3240" w:hanging="360"/>
-      </w:pPr>
-      <w:rPr>
-        <w:rFonts w:ascii="Symbol" w:hAnsi="Symbol" w:cs="Symbol" w:hint="default"/>
-      </w:rPr>
-    </w:lvl>
-    <w:lvl w:ilvl="8">
-      <w:start w:val="1"/>
-      <w:numFmt w:val="bullet"/>
-      <w:lvlText w:val=""/>
-      <w:lvlJc w:val="left"/>
-      <w:pPr>
-        <w:tabs>
-          <w:tab w:val="num" w:pos="3600"/>
-        </w:tabs>
-        <w:ind w:left="3600" w:hanging="360"/>
-      </w:pPr>
-      <w:rPr>
-        <w:rFonts w:ascii="Symbol" w:hAnsi="Symbol" w:cs="Symbol" w:hint="default"/>
-      </w:rPr>
-    </w:lvl>
-  </w:abstractNum>
-  <w:abstractNum w:abstractNumId="3">
-    <w:lvl w:ilvl="0">
-      <w:start w:val="1"/>
-      <w:numFmt w:val="none"/>
-      <w:suff w:val="nothing"/>
-      <w:lvlText w:val=""/>
-      <w:lvlJc w:val="left"/>
-      <w:pPr>
-        <w:tabs>
-          <w:tab w:val="num" w:pos="0"/>
-        </w:tabs>
-        <w:ind w:left="0" w:hanging="0"/>
-      </w:pPr>
-    </w:lvl>
-    <w:lvl w:ilvl="1">
-      <w:start w:val="1"/>
-      <w:numFmt w:val="none"/>
-      <w:suff w:val="nothing"/>
-      <w:lvlText w:val=""/>
-      <w:lvlJc w:val="left"/>
-      <w:pPr>
-        <w:tabs>
-          <w:tab w:val="num" w:pos="0"/>
-        </w:tabs>
-        <w:ind w:left="0" w:hanging="0"/>
-      </w:pPr>
-    </w:lvl>
-    <w:lvl w:ilvl="2">
-      <w:start w:val="1"/>
-      <w:numFmt w:val="none"/>
-      <w:suff w:val="nothing"/>
-      <w:lvlText w:val=""/>
-      <w:lvlJc w:val="left"/>
-      <w:pPr>
-        <w:tabs>
-          <w:tab w:val="num" w:pos="0"/>
-        </w:tabs>
-        <w:ind w:left="0" w:hanging="0"/>
-      </w:pPr>
-    </w:lvl>
-    <w:lvl w:ilvl="3">
-      <w:start w:val="1"/>
-      <w:numFmt w:val="none"/>
-      <w:suff w:val="nothing"/>
-      <w:lvlText w:val=""/>
-      <w:lvlJc w:val="left"/>
-      <w:pPr>
-        <w:tabs>
-          <w:tab w:val="num" w:pos="0"/>
-        </w:tabs>
-        <w:ind w:left="0" w:hanging="0"/>
-      </w:pPr>
-    </w:lvl>
-    <w:lvl w:ilvl="4">
-      <w:start w:val="1"/>
-      <w:numFmt w:val="none"/>
-      <w:suff w:val="nothing"/>
-      <w:lvlText w:val=""/>
-      <w:lvlJc w:val="left"/>
-      <w:pPr>
-        <w:tabs>
-          <w:tab w:val="num" w:pos="0"/>
-        </w:tabs>
-        <w:ind w:left="0" w:hanging="0"/>
-      </w:pPr>
-    </w:lvl>
-    <w:lvl w:ilvl="5">
-      <w:start w:val="1"/>
-      <w:numFmt w:val="none"/>
-      <w:suff w:val="nothing"/>
-      <w:lvlText w:val=""/>
-      <w:lvlJc w:val="left"/>
-      <w:pPr>
-        <w:tabs>
-          <w:tab w:val="num" w:pos="0"/>
-        </w:tabs>
-        <w:ind w:left="0" w:hanging="0"/>
-      </w:pPr>
-    </w:lvl>
-    <w:lvl w:ilvl="6">
-      <w:start w:val="1"/>
-      <w:numFmt w:val="none"/>
-      <w:suff w:val="nothing"/>
-      <w:lvlText w:val=""/>
-      <w:lvlJc w:val="left"/>
-      <w:pPr>
-        <w:tabs>
-          <w:tab w:val="num" w:pos="0"/>
-        </w:tabs>
-        <w:ind w:left="0" w:hanging="0"/>
-      </w:pPr>
-    </w:lvl>
-    <w:lvl w:ilvl="7">
-      <w:start w:val="1"/>
-      <w:numFmt w:val="none"/>
-      <w:suff w:val="nothing"/>
-      <w:lvlText w:val=""/>
-      <w:lvlJc w:val="left"/>
-      <w:pPr>
-        <w:tabs>
-          <w:tab w:val="num" w:pos="0"/>
-        </w:tabs>
-        <w:ind w:left="0" w:hanging="0"/>
-      </w:pPr>
-    </w:lvl>
-    <w:lvl w:ilvl="8">
-      <w:start w:val="1"/>
-      <w:numFmt w:val="none"/>
-      <w:suff w:val="nothing"/>
-      <w:lvlText w:val=""/>
-      <w:lvlJc w:val="left"/>
-      <w:pPr>
-        <w:tabs>
-          <w:tab w:val="num" w:pos="0"/>
-        </w:tabs>
-        <w:ind w:left="0" w:hanging="0"/>
-      </w:pPr>
-    </w:lvl>
-  </w:abstractNum>
-  <w:num w:numId="1">
-    <w:abstractNumId w:val="1"/>
-  </w:num>
-  <w:num w:numId="2">
-    <w:abstractNumId w:val="2"/>
-  </w:num>
-  <w:num w:numId="3">
-    <w:abstractNumId w:val="3"/>
-  </w:num>
-</w:numbering>
 </file>
 
 <file path=word/styles.xml><?xml version="1.0" encoding="utf-8"?>
@@ -13517,15 +12971,15 @@
     <w:qFormat/>
     <w:rPr/>
   </w:style>
-  <w:style w:type="character" w:styleId="Bulletsuser">
-    <w:name w:val="Bullets (user)"/>
+  <w:style w:type="character" w:styleId="Bullets">
+    <w:name w:val="Bullets"/>
     <w:qFormat/>
     <w:rPr>
       <w:rFonts w:ascii="OpenSymbol" w:hAnsi="OpenSymbol" w:eastAsia="OpenSymbol" w:cs="OpenSymbol"/>
     </w:rPr>
   </w:style>
-  <w:style w:type="character" w:styleId="Bullets">
-    <w:name w:val="Bullets"/>
+  <w:style w:type="character" w:styleId="Bulletsuser">
+    <w:name w:val="Bullets (user)"/>
     <w:qFormat/>
     <w:rPr>
       <w:rFonts w:ascii="OpenSymbol" w:hAnsi="OpenSymbol" w:eastAsia="OpenSymbol" w:cs="OpenSymbol"/>
@@ -13807,15 +13261,15 @@
     <w:pPr/>
     <w:rPr/>
   </w:style>
-  <w:style w:type="paragraph" w:styleId="FrameContentsuser">
-    <w:name w:val="Frame Contents (user)"/>
+  <w:style w:type="paragraph" w:styleId="FrameContents">
+    <w:name w:val="Frame Contents"/>
     <w:basedOn w:val="Normal"/>
     <w:qFormat/>
     <w:pPr/>
     <w:rPr/>
   </w:style>
-  <w:style w:type="paragraph" w:styleId="FrameContents">
-    <w:name w:val="Frame Contents"/>
+  <w:style w:type="paragraph" w:styleId="FrameContentsuser">
+    <w:name w:val="Frame Contents (user)"/>
     <w:basedOn w:val="Normal"/>
     <w:qFormat/>
     <w:pPr/>

</xml_diff>